<commit_message>
Rename project to Krishilens; fix portfolio date, footer and dashes
</commit_message>
<xml_diff>
--- a/portfolio.docx
+++ b/portfolio.docx
@@ -53,7 +53,7 @@
           <w:sz w:val="40"/>
           <w:szCs w:val="40"/>
         </w:rPr>
-        <w:t xml:space="preserve">PatteVaidya</w:t>
+        <w:t>Krishilens</w:t>
       </w:r>
     </w:p>
     <w:p>
@@ -83,7 +83,7 @@
           <w:sz w:val="22"/>
           <w:szCs w:val="22"/>
         </w:rPr>
-        <w:t xml:space="preserve">A 4.36 MB model that names a leaf disease from one photo and tells the farmer what to do about it — fully offline, with no account and no data leaving the phone.</w:t>
+        <w:t>A 4.36 MB model that names a leaf disease from one photo and tells the farmer what to do about it, fully offline, with no account and no data leaving the phone.</w:t>
       </w:r>
     </w:p>
     <w:tbl>
@@ -148,7 +148,7 @@
                 <w:sz w:val="20"/>
                 <w:szCs w:val="20"/>
               </w:rPr>
-              <w:t xml:space="preserve">Krishi Lens</w:t>
+              <w:t>KrishiNova</w:t>
             </w:r>
           </w:p>
         </w:tc>
@@ -176,7 +176,7 @@
                 <w:sz w:val="20"/>
                 <w:szCs w:val="20"/>
               </w:rPr>
-              <w:t xml:space="preserve">College / Institute</w:t>
+              <w:t>Lead institution</w:t>
             </w:r>
           </w:p>
         </w:tc>
@@ -199,7 +199,7 @@
                 <w:sz w:val="20"/>
                 <w:szCs w:val="20"/>
               </w:rPr>
-              <w:t xml:space="preserve">IITG</w:t>
+              <w:t>Indian Institute of Technology Guwahati (IIT Guwahati)</w:t>
             </w:r>
           </w:p>
         </w:tc>
@@ -253,7 +253,11 @@
               <w:rPr>
                 <w:b/>
               </w:rPr>
-              <w:t>Harshit Dwivedi</w:t>
+              <w:t>Harshit Dwivedi (Team Lead): dataset curation, model training and ONNX export, Leaf Guard, advisory engine, Gradio app, profiling, documentation, training kit and portfolio</w:t>
+              <w:br/>
+              <w:t>Mahak Jaiswal, interface design, UI decisions document (docs/UI_DECISIONS.md), Hindi copy review, screenshots, visual QA, pitch and demo</w:t>
+              <w:br/>
+              <w:t>Anurag Dwivedi, problem research, camera flow, environment setup, unit tests for the Leaf Guard (tests/test_guard.py)</w:t>
             </w:r>
             <w:r>
               <w:rPr>
@@ -266,63 +270,6 @@
               <w:rPr>
                 <w:b w:val="0"/>
               </w:rPr>
-              <w:t xml:space="preserve"> — dataset curation, model training and ONNX export, Leaf Guard, advisory engine, Gradio app, profiling, documentation, training kit and portfolio</w:t>
-            </w:r>
-          </w:p>
-          <w:p>
-            <w:r>
-              <w:rPr>
-                <w:b w:val="false"/>
-                <w:bCs w:val="false"/>
-                <w:color w:val="575248"/>
-                <w:sz w:val="20"/>
-                <w:szCs w:val="20"/>
-              </w:rPr>
-              <w:rPr>
-                <w:b/>
-              </w:rPr>
-              <w:t>Mahak Jaiswal</w:t>
-            </w:r>
-            <w:r>
-              <w:rPr>
-                <w:b w:val="false"/>
-                <w:bCs w:val="false"/>
-                <w:color w:val="575248"/>
-                <w:sz w:val="20"/>
-                <w:szCs w:val="20"/>
-              </w:rPr>
-              <w:rPr>
-                <w:b w:val="0"/>
-              </w:rPr>
-              <w:t xml:space="preserve"> — design and research, UI/UX, pitch and demo, problem research</w:t>
-            </w:r>
-          </w:p>
-          <w:p>
-            <w:r>
-              <w:rPr>
-                <w:b w:val="false"/>
-                <w:bCs w:val="false"/>
-                <w:color w:val="575248"/>
-                <w:sz w:val="20"/>
-                <w:szCs w:val="20"/>
-              </w:rPr>
-              <w:rPr>
-                <w:b/>
-              </w:rPr>
-              <w:t>Nimish Garg</w:t>
-            </w:r>
-            <w:r>
-              <w:rPr>
-                <w:b w:val="false"/>
-                <w:bCs w:val="false"/>
-                <w:color w:val="575248"/>
-                <w:sz w:val="20"/>
-                <w:szCs w:val="20"/>
-              </w:rPr>
-              <w:rPr>
-                <w:b w:val="0"/>
-              </w:rPr>
-              <w:t xml:space="preserve"> — front-end engineering, application interface and camera flow</w:t>
             </w:r>
           </w:p>
         </w:tc>
@@ -376,7 +323,7 @@
               <w:rPr>
                 <w:b w:val="0"/>
               </w:rPr>
-              <w:t>dubeybittu026@gmail.com</w:t>
+              <w:t>krishinovateam@gmail.com</w:t>
             </w:r>
           </w:p>
         </w:tc>
@@ -478,7 +425,7 @@
                 <w:sz w:val="20"/>
                 <w:szCs w:val="20"/>
               </w:rPr>
-              <w:t xml:space="preserve">October 2026</w:t>
+              <w:t>1 November 2026</w:t>
             </w:r>
           </w:p>
         </w:tc>
@@ -690,7 +637,7 @@
                 <w:sz w:val="20"/>
                 <w:szCs w:val="20"/>
               </w:rPr>
-              <w:t xml:space="preserve">crop_disease.onnx — 4.36 MB, fp32</w:t>
+              <w:t>crop_disease.onnx: 4.36 MB, fp32</w:t>
             </w:r>
           </w:p>
         </w:tc>
@@ -843,7 +790,7 @@
                 <w:sz w:val="20"/>
                 <w:szCs w:val="20"/>
               </w:rPr>
-              <w:t xml:space="preserve">90.1% on 1,140 held-out images the model never saw in training</w:t>
+              <w:t>92.2% on 10,858 held-out images the model never saw in training</w:t>
             </w:r>
           </w:p>
         </w:tc>
@@ -894,7 +841,7 @@
                 <w:sz w:val="20"/>
                 <w:szCs w:val="20"/>
               </w:rPr>
-              <w:t xml:space="preserve">0 bytes — no photo, no location, no account</w:t>
+              <w:t>0 bytes: no photo, no location, no account</w:t>
             </w:r>
           </w:p>
         </w:tc>
@@ -1036,7 +983,7 @@
           <w:sz w:val="21"/>
           <w:szCs w:val="21"/>
         </w:rPr>
-        <w:t xml:space="preserve">Every season, Indian farmers lose a large share of their crop to pests and diseases. Most of them have no quick, affordable way to find out what is wrong with their plants. Diagnosis today depends on agricultural extension officers who are few and far between, or on guesswork — which often leads to the wrong pesticide, over-spraying, higher cost and lower income.</w:t>
+        <w:t>Every season, Indian farmers lose a large share of their crop to pests and diseases. Most of them have no quick, affordable way to find out what is wrong with their plants. Diagnosis today depends on agricultural extension officers who are few and far between, or on guesswork, which often leads to the wrong pesticide, over-spraying, higher cost and lower income.</w:t>
       </w:r>
     </w:p>
     <w:p>
@@ -1197,7 +1144,7 @@
           <w:sz w:val="21"/>
           <w:szCs w:val="21"/>
         </w:rPr>
-        <w:t xml:space="preserve">A fast, offline diagnosis directly reduces wrong pesticide use, cuts input cost, and protects yield — with no dependence on connectivity or on an officer's visit.</w:t>
+        <w:t>A fast, offline diagnosis directly reduces wrong pesticide use, cuts input cost, and protects yield, with no dependence on connectivity or on an officer's visit.</w:t>
       </w:r>
     </w:p>
     <w:p>
@@ -1234,7 +1181,7 @@
           <w:sz w:val="21"/>
           <w:szCs w:val="21"/>
         </w:rPr>
-        <w:t xml:space="preserve">This is not a proposal. The pipeline, the model, the guard, the advisory and the demo all run today.</w:t>
+        <w:t>This is not a proposal. The pipeline, the model, the guard, the advisory and the desktop demo all run today. The phone interface in Section 4 is a design mockup, clearly marked as such.</w:t>
       </w:r>
     </w:p>
     <w:p>
@@ -1271,7 +1218,7 @@
           <w:sz w:val="21"/>
           <w:szCs w:val="21"/>
         </w:rPr>
-        <w:t xml:space="preserve">Leaf Guard — </w:t>
+        <w:t>Leaf Guard: refuses the photo when it is not a supported crop or when the model is not confident, instead of guessing.</w:t>
       </w:r>
       <w:r>
         <w:rPr>
@@ -1279,7 +1226,6 @@
           <w:sz w:val="21"/>
           <w:szCs w:val="21"/>
         </w:rPr>
-        <w:t xml:space="preserve">refuses the photo when it is not a supported crop or when the model is not confident, instead of guessing.</w:t>
       </w:r>
     </w:p>
     <w:p>
@@ -1299,7 +1245,7 @@
           <w:sz w:val="21"/>
           <w:szCs w:val="21"/>
         </w:rPr>
-        <w:t xml:space="preserve">Leaf segmentation — </w:t>
+        <w:t>Leaf segmentation: finds the leaf in the frame, and handles several leaves in one photo by classifying each region.</w:t>
       </w:r>
       <w:r>
         <w:rPr>
@@ -1307,7 +1253,6 @@
           <w:sz w:val="21"/>
           <w:szCs w:val="21"/>
         </w:rPr>
-        <w:t xml:space="preserve">finds the leaf in the frame, and handles several leaves in one photo by classifying each region.</w:t>
       </w:r>
     </w:p>
     <w:p>
@@ -1327,7 +1272,7 @@
           <w:sz w:val="21"/>
           <w:szCs w:val="21"/>
         </w:rPr>
-        <w:t>Classifier — 38 class scores from the ONNX model in about 0.7 ms.</w:t>
+        <w:t>Classifier: 38 class scores from the ONNX model in about 0.7 ms.</w:t>
       </w:r>
       <w:r>
         <w:rPr>
@@ -1354,7 +1299,7 @@
           <w:sz w:val="21"/>
           <w:szCs w:val="21"/>
         </w:rPr>
-        <w:t xml:space="preserve">Advisory — </w:t>
+        <w:t>Advisory: treatment name and dose, a local stock check, and the rupee value of the crop saved.</w:t>
       </w:r>
       <w:r>
         <w:rPr>
@@ -1362,7 +1307,6 @@
           <w:sz w:val="21"/>
           <w:szCs w:val="21"/>
         </w:rPr>
-        <w:t xml:space="preserve">treatment name and dose, a local stock check, and the rupee value of the crop saved.</w:t>
       </w:r>
     </w:p>
     <w:p>
@@ -1382,7 +1326,7 @@
           <w:sz w:val="21"/>
           <w:szCs w:val="21"/>
         </w:rPr>
-        <w:t xml:space="preserve">Offline demo — </w:t>
+        <w:t>Offline demo: a Gradio application that runs the whole path locally, with the network unplugged.</w:t>
       </w:r>
       <w:r>
         <w:rPr>
@@ -1390,7 +1334,6 @@
           <w:sz w:val="21"/>
           <w:szCs w:val="21"/>
         </w:rPr>
-        <w:t xml:space="preserve">a Gradio application that runs the whole path locally, with the network unplugged.</w:t>
       </w:r>
     </w:p>
     <w:p>
@@ -1407,7 +1350,7 @@
           <w:sz w:val="24"/>
           <w:szCs w:val="24"/>
         </w:rPr>
-        <w:t xml:space="preserve">What the farmer sees</w:t>
+        <w:t>Design direction (mockups, not yet built)</w:t>
       </w:r>
     </w:p>
     <w:p>
@@ -1424,7 +1367,7 @@
           <w:sz w:val="21"/>
           <w:szCs w:val="21"/>
         </w:rPr>
-        <w:t xml:space="preserve">Three screens, one job each: take a photo, get a decision, or get an honest refusal with three tips on how to retake it. The design deliberately leads with the decision — dose, stock and rupees — rather than with a class name.</w:t>
+        <w:t>We designed three screens: take a photo, get a decision, or get an honest refusal with three tips on how to retake it. These are design mockups, not screenshots of the shipping app: the working demo today is a Gradio desktop application, and a phone build is on the roadmap. The design deliberately leads with the decision, dose, stock and rupees, rather than with a class name.</w:t>
       </w:r>
     </w:p>
     <w:p>
@@ -1486,7 +1429,7 @@
           <w:sz w:val="17"/>
           <w:szCs w:val="17"/>
         </w:rPr>
-        <w:t xml:space="preserve">Interface design: capture, refusal, and the advisory. A refusal is a designed state, not an error.</w:t>
+        <w:t>Design mockup: capture, refusal and the advisory. A refusal is a designed state, not an error. Not yet implemented in the shipping app.</w:t>
       </w:r>
     </w:p>
     <w:p>
@@ -1523,7 +1466,7 @@
           <w:sz w:val="21"/>
           <w:szCs w:val="21"/>
         </w:rPr>
-        <w:t xml:space="preserve">The pipeline has one path and one real branch. An unsupported crop, or a photo the model is not sure about, exits at the guard before the classifier ever runs — so the app can say "not sure" instead of guessing.</w:t>
+        <w:t>The pipeline has one path and one real branch. An unsupported crop, or a photo the model is not sure about, exits at the guard before the classifier ever runs, so the app can say "not sure" instead of guessing.</w:t>
       </w:r>
     </w:p>
     <w:p>
@@ -1619,7 +1562,7 @@
           <w:sz w:val="21"/>
           <w:szCs w:val="21"/>
         </w:rPr>
-        <w:t xml:space="preserve">That choice is the whole design. Because the backbone never changes, training runs in minutes on a laptop CPU with no GPU, and the exported model stays at 4.36 MB — small enough to sit inside an application on a low-end phone.</w:t>
+        <w:t>That choice is the whole design. Because the backbone never changes, training runs in minutes on a laptop CPU with no GPU, and the exported model stays at 4.36 MB, small enough to sit inside an application on a low-end phone.</w:t>
       </w:r>
     </w:p>
     <w:p>
@@ -2320,7 +2263,7 @@
                 <w:sz w:val="20"/>
                 <w:szCs w:val="20"/>
               </w:rPr>
-              <w:t xml:space="preserve">90.1%</w:t>
+              <w:t>92.2%</w:t>
             </w:r>
           </w:p>
         </w:tc>
@@ -2343,7 +2286,7 @@
                 <w:sz w:val="20"/>
                 <w:szCs w:val="20"/>
               </w:rPr>
-              <w:t xml:space="preserve">1,140 held-out images, 38 classes</w:t>
+              <w:t>10,858 held-out images, 38 classes</w:t>
             </w:r>
           </w:p>
         </w:tc>
@@ -2704,7 +2647,7 @@
           <w:sz w:val="17"/>
           <w:szCs w:val="17"/>
         </w:rPr>
-        <w:t xml:space="preserve">Sample predictions on unseen leaves. Correct answers in green, wrong answers in red — we show both.</w:t>
+        <w:t>Sample predictions on unseen leaves. Correct answers in green, wrong answers in red, we show both.</w:t>
       </w:r>
     </w:p>
     <w:p>
@@ -2885,7 +2828,7 @@
                 <w:sz w:val="20"/>
                 <w:szCs w:val="20"/>
               </w:rPr>
-              <w:t xml:space="preserve">13–15% on real field images (PlantDoc benchmark)</w:t>
+              <w:t>30.9% on real field images (PlantDoc); 61.4% on the 70 photos the guard answers</w:t>
             </w:r>
           </w:p>
         </w:tc>
@@ -2908,7 +2851,7 @@
                 <w:sz w:val="20"/>
                 <w:szCs w:val="20"/>
               </w:rPr>
-              <w:t xml:space="preserve">On a photo taken in a field, the model is far less reliable than the 90.1% headline suggests</w:t>
+              <w:t>On a photo taken in a field, the model is far less reliable than the 92.2% headline suggests</w:t>
             </w:r>
           </w:p>
         </w:tc>
@@ -3130,7 +3073,7 @@
                 <w:sz w:val="20"/>
                 <w:szCs w:val="20"/>
               </w:rPr>
-              <w:t xml:space="preserve">Wheat, rice, sugarcane, cotton and pulses are missing — most of India's fields</w:t>
+              <w:t>Wheat, rice, sugarcane, cotton and pulses are missing: most of India's fields</w:t>
             </w:r>
           </w:p>
         </w:tc>
@@ -3181,7 +3124,7 @@
                 <w:sz w:val="20"/>
                 <w:szCs w:val="20"/>
               </w:rPr>
-              <w:t xml:space="preserve">English only</w:t>
+              <w:t>Hindi and English</w:t>
             </w:r>
           </w:p>
         </w:tc>
@@ -3204,7 +3147,7 @@
                 <w:sz w:val="20"/>
                 <w:szCs w:val="20"/>
               </w:rPr>
-              <w:t xml:space="preserve">A farmer who cannot read English cannot use it yet</w:t>
+              <w:t>Hindi advisory, Hindi labels and a spoken answer; regional languages are not there yet</w:t>
             </w:r>
           </w:p>
         </w:tc>
@@ -3587,7 +3530,7 @@
                 <w:sz w:val="20"/>
                 <w:szCs w:val="20"/>
               </w:rPr>
-              <w:t xml:space="preserve">Ship Hindi and a spoken answer</w:t>
+              <w:t>Ship regional languages</w:t>
             </w:r>
           </w:p>
         </w:tc>
@@ -3610,7 +3553,7 @@
                 <w:sz w:val="20"/>
                 <w:szCs w:val="20"/>
               </w:rPr>
-              <w:t xml:space="preserve">Reaches the farmer the app is actually for</w:t>
+              <w:t>Hindi and a spoken answer are shipped; Marathi, Telugu and Bengali are next</w:t>
             </w:r>
           </w:p>
         </w:tc>
@@ -4465,7 +4408,7 @@
                 <w:sz w:val="20"/>
                 <w:szCs w:val="20"/>
               </w:rPr>
-              <w:t xml:space="preserve">Dataset bias — PlantVillage images are lab-quality, real field photos differ</w:t>
+              <w:t>Dataset bias: PlantVillage images are lab-quality, real field photos differ</w:t>
             </w:r>
           </w:p>
         </w:tc>
@@ -4750,7 +4693,7 @@
           <w:sz w:val="21"/>
           <w:szCs w:val="21"/>
         </w:rPr>
-        <w:t xml:space="preserve">Dhaliwal, G. S. et al. (2010). Pre- and post-harvest losses in agricultural produce — pest and disease loss estimates.</w:t>
+        <w:t>Dhaliwal, G. S. Et al. (2010). Pre- and post-harvest losses in agricultural produce, pest and disease loss estimates.</w:t>
       </w:r>
     </w:p>
     <w:p>
@@ -4857,7 +4800,7 @@
           <w:sz w:val="21"/>
           <w:szCs w:val="21"/>
         </w:rPr>
-        <w:t xml:space="preserve">Singh, D., Jain, N., Jain, P., Kayal, P., Kumawat, S. &amp; Batra, N. (2020). PlantDoc: A Dataset for Visual Plant Disease Detection. CoDS-COMAD 2020. The 13–15% field figure comes from this benchmark. Licence: CC BY 4.0.</w:t>
+        <w:t>Singh, D., Jain, N., Jain, P., Kayal, P., Kumawat, S. &amp; Batra, N. (2020). PlantDoc: A Dataset for Visual Plant Disease Detection. CoDS-COMAD 2020. The 30.9% field figure comes from this benchmark. Licence: CC BY 4.0.</w:t>
       </w:r>
     </w:p>
     <w:p>
@@ -4921,44 +4864,7 @@
         <w:jc w:val="center"/>
       </w:pPr>
       <w:r>
-        <w:drawing>
-          <wp:inline distT="0" distB="0" distL="0" distR="0">
-            <wp:extent cx="6096000" cy="2428875"/>
-            <wp:effectExtent t="0" r="0" b="0" l="0"/>
-            <wp:docPr id="4" name="" descr="" title=""/>
-            <wp:cNvGraphicFramePr>
-              <a:graphicFrameLocks xmlns:a="http://schemas.openxmlformats.org/drawingml/2006/main" noChangeAspect="1"/>
-            </wp:cNvGraphicFramePr>
-            <a:graphic xmlns:a="http://schemas.openxmlformats.org/drawingml/2006/main">
-              <a:graphicData uri="http://schemas.openxmlformats.org/drawingml/2006/picture">
-                <pic:pic xmlns:pic="http://schemas.openxmlformats.org/drawingml/2006/picture">
-                  <pic:nvPicPr>
-                    <pic:cNvPr id="0" name="" descr=""/>
-                    <pic:cNvPicPr>
-                      <a:picLocks noChangeAspect="1" noChangeArrowheads="1"/>
-                    </pic:cNvPicPr>
-                  </pic:nvPicPr>
-                  <pic:blipFill>
-                    <a:blip r:embed="rId11" cstate="none"/>
-                    <a:srcRect/>
-                    <a:stretch>
-                      <a:fillRect/>
-                    </a:stretch>
-                  </pic:blipFill>
-                  <pic:spPr bwMode="auto">
-                    <a:xfrm>
-                      <a:off x="0" y="0"/>
-                      <a:ext cx="6096000" cy="2428875"/>
-                    </a:xfrm>
-                    <a:prstGeom prst="rect">
-                      <a:avLst/>
-                    </a:prstGeom>
-                  </pic:spPr>
-                </pic:pic>
-              </a:graphicData>
-            </a:graphic>
-          </wp:inline>
-        </w:drawing>
+        <w:t>Team of three: Harshit Dwivedi (model and app, IIT Guwahati), Mahak Jaiswal (interface design, UI documentation, pitch and demo) and Anurag Dwivedi (research, setup and guard tests, MMDU).</w:t>
       </w:r>
     </w:p>
     <w:p>
@@ -4985,6 +4891,9 @@
     </w:p>
     <w:sectPr>
       <w:footerReference w:type="default" r:id="rId6"/>
+      <w:headerReference w:type="default" r:id="rId13"/>
+      <w:footerReference w:type="first" r:id="rId14"/>
+      <w:headerReference w:type="first" r:id="rId15"/>
       <w:pgSz w:w="11906" w:h="16838" w:orient="portrait"/>
       <w:pgMar w:top="1100" w:right="1150" w:bottom="1000" w:left="1150" w:header="708" w:footer="708" w:gutter="0"/>
       <w:pgNumType/>
@@ -5043,7 +4952,7 @@
         <w:sz w:val="16"/>
         <w:szCs w:val="16"/>
       </w:rPr>
-      <w:t xml:space="preserve">PatteVaidya — Project Portfolio   ·   page </w:t>
+      <w:t xml:space="preserve">Krishilens | Project Portfolio   ·   page </w:t>
     </w:r>
     <w:r>
       <w:rPr>
@@ -5051,11 +4960,17 @@
         <w:sz w:val="16"/>
         <w:szCs w:val="16"/>
       </w:rPr>
-      <w:fldChar w:fldCharType="begin"/>
-      <w:instrText xml:space="preserve">PAGE</w:instrText>
-      <w:fldChar w:fldCharType="separate"/>
-      <w:fldChar w:fldCharType="end"/>
     </w:r>
+  </w:p>
+</w:ftr>
+</file>
+
+<file path=word/footer2.xml><?xml version="1.0" encoding="utf-8"?>
+<w:ftr xmlns:m="http://schemas.openxmlformats.org/officeDocument/2006/math" xmlns:mc="http://schemas.openxmlformats.org/markup-compatibility/2006" xmlns:mo="http://schemas.microsoft.com/office/mac/office/2008/main" xmlns:mv="urn:schemas-microsoft-com:mac:vml" xmlns:o="urn:schemas-microsoft-com:office:office" xmlns:r="http://schemas.openxmlformats.org/officeDocument/2006/relationships" xmlns:v="urn:schemas-microsoft-com:vml" xmlns:w10="urn:schemas-microsoft-com:office:word" xmlns:w14="http://schemas.microsoft.com/office/word/2010/wordml" xmlns:w="http://schemas.openxmlformats.org/wordprocessingml/2006/main" xmlns:wne="http://schemas.microsoft.com/office/word/2006/wordml" xmlns:wp14="http://schemas.microsoft.com/office/word/2010/wordprocessingDrawing" xmlns:wp="http://schemas.openxmlformats.org/drawingml/2006/wordprocessingDrawing" xmlns:wpc="http://schemas.microsoft.com/office/word/2010/wordprocessingCanvas" xmlns:wpg="http://schemas.microsoft.com/office/word/2010/wordprocessingGroup" xmlns:wpi="http://schemas.microsoft.com/office/word/2010/wordprocessingInk" xmlns:wps="http://schemas.microsoft.com/office/word/2010/wordprocessingShape" mc:Ignorable="w14 wp14">
+  <w:p>
+    <w:pPr>
+      <w:pStyle w:val="Footer"/>
+    </w:pPr>
   </w:p>
 </w:ftr>
 </file>
@@ -5095,6 +5010,26 @@
     </w:p>
   </w:footnote>
 </w:footnotes>
+</file>
+
+<file path=word/header1.xml><?xml version="1.0" encoding="utf-8"?>
+<w:hdr xmlns:m="http://schemas.openxmlformats.org/officeDocument/2006/math" xmlns:mc="http://schemas.openxmlformats.org/markup-compatibility/2006" xmlns:mo="http://schemas.microsoft.com/office/mac/office/2008/main" xmlns:mv="urn:schemas-microsoft-com:mac:vml" xmlns:o="urn:schemas-microsoft-com:office:office" xmlns:r="http://schemas.openxmlformats.org/officeDocument/2006/relationships" xmlns:v="urn:schemas-microsoft-com:vml" xmlns:w10="urn:schemas-microsoft-com:office:word" xmlns:w14="http://schemas.microsoft.com/office/word/2010/wordml" xmlns:w="http://schemas.openxmlformats.org/wordprocessingml/2006/main" xmlns:wne="http://schemas.microsoft.com/office/word/2006/wordml" xmlns:wp14="http://schemas.microsoft.com/office/word/2010/wordprocessingDrawing" xmlns:wp="http://schemas.openxmlformats.org/drawingml/2006/wordprocessingDrawing" xmlns:wpc="http://schemas.microsoft.com/office/word/2010/wordprocessingCanvas" xmlns:wpg="http://schemas.microsoft.com/office/word/2010/wordprocessingGroup" xmlns:wpi="http://schemas.microsoft.com/office/word/2010/wordprocessingInk" xmlns:wps="http://schemas.microsoft.com/office/word/2010/wordprocessingShape" mc:Ignorable="w14 wp14">
+  <w:p>
+    <w:pPr>
+      <w:pStyle w:val="Header"/>
+    </w:pPr>
+  </w:p>
+</w:hdr>
+</file>
+
+<file path=word/header2.xml><?xml version="1.0" encoding="utf-8"?>
+<w:hdr xmlns:m="http://schemas.openxmlformats.org/officeDocument/2006/math" xmlns:mc="http://schemas.openxmlformats.org/markup-compatibility/2006" xmlns:mo="http://schemas.microsoft.com/office/mac/office/2008/main" xmlns:mv="urn:schemas-microsoft-com:mac:vml" xmlns:o="urn:schemas-microsoft-com:office:office" xmlns:r="http://schemas.openxmlformats.org/officeDocument/2006/relationships" xmlns:v="urn:schemas-microsoft-com:vml" xmlns:w10="urn:schemas-microsoft-com:office:word" xmlns:w14="http://schemas.microsoft.com/office/word/2010/wordml" xmlns:w="http://schemas.openxmlformats.org/wordprocessingml/2006/main" xmlns:wne="http://schemas.microsoft.com/office/word/2006/wordml" xmlns:wp14="http://schemas.microsoft.com/office/word/2010/wordprocessingDrawing" xmlns:wp="http://schemas.openxmlformats.org/drawingml/2006/wordprocessingDrawing" xmlns:wpc="http://schemas.microsoft.com/office/word/2010/wordprocessingCanvas" xmlns:wpg="http://schemas.microsoft.com/office/word/2010/wordprocessingGroup" xmlns:wpi="http://schemas.microsoft.com/office/word/2010/wordprocessingInk" xmlns:wps="http://schemas.microsoft.com/office/word/2010/wordprocessingShape" mc:Ignorable="w14 wp14">
+  <w:p>
+    <w:pPr>
+      <w:pStyle w:val="Header"/>
+    </w:pPr>
+  </w:p>
+</w:hdr>
 </file>
 
 <file path=word/numbering.xml><?xml version="1.0" encoding="utf-8"?>

</xml_diff>